<commit_message>
IND Bo7: nowy szablon + Mecz # (ukrywane w finałach) + nowy CZWÓRKA Bo5
</commit_message>
<xml_diff>
--- a/IND_Bo7.docx
+++ b/IND_Bo7.docx
@@ -10,25 +10,25 @@
         <w:tblLook w:val="04A0" w:firstRow="1" w:lastRow="0" w:firstColumn="1" w:lastColumn="0" w:noHBand="0" w:noVBand="1"/>
       </w:tblPr>
       <w:tblGrid>
-        <w:gridCol w:w="1272"/>
-        <w:gridCol w:w="1366"/>
+        <w:gridCol w:w="1219"/>
+        <w:gridCol w:w="1587"/>
         <w:gridCol w:w="779"/>
-        <w:gridCol w:w="93"/>
-        <w:gridCol w:w="810"/>
-        <w:gridCol w:w="810"/>
+        <w:gridCol w:w="86"/>
+        <w:gridCol w:w="798"/>
+        <w:gridCol w:w="798"/>
         <w:gridCol w:w="71"/>
-        <w:gridCol w:w="739"/>
-        <w:gridCol w:w="810"/>
-        <w:gridCol w:w="586"/>
-        <w:gridCol w:w="224"/>
-        <w:gridCol w:w="474"/>
-        <w:gridCol w:w="336"/>
+        <w:gridCol w:w="727"/>
+        <w:gridCol w:w="803"/>
+        <w:gridCol w:w="577"/>
+        <w:gridCol w:w="220"/>
+        <w:gridCol w:w="465"/>
+        <w:gridCol w:w="332"/>
         <w:gridCol w:w="166"/>
         <w:gridCol w:w="271"/>
-        <w:gridCol w:w="463"/>
-        <w:gridCol w:w="601"/>
-        <w:gridCol w:w="862"/>
-        <w:gridCol w:w="742"/>
+        <w:gridCol w:w="459"/>
+        <w:gridCol w:w="591"/>
+        <w:gridCol w:w="761"/>
+        <w:gridCol w:w="765"/>
       </w:tblGrid>
       <w:tr>
         <w:trPr>
@@ -36,7 +36,7 @@
         </w:trPr>
         <w:tc>
           <w:tcPr>
-            <w:tcW w:w="1272" w:type="dxa"/>
+            <w:tcW w:w="1219" w:type="dxa"/>
             <w:tcBorders>
               <w:top w:val="nil"/>
               <w:left w:val="nil"/>
@@ -63,7 +63,7 @@
         </w:tc>
         <w:tc>
           <w:tcPr>
-            <w:tcW w:w="1366" w:type="dxa"/>
+            <w:tcW w:w="1587" w:type="dxa"/>
             <w:tcBorders>
               <w:top w:val="nil"/>
               <w:left w:val="nil"/>
@@ -99,7 +99,7 @@
         </w:tc>
         <w:tc>
           <w:tcPr>
-            <w:tcW w:w="1784" w:type="dxa"/>
+            <w:tcW w:w="1753" w:type="dxa"/>
             <w:gridSpan w:val="4"/>
             <w:tcBorders>
               <w:top w:val="none" w:sz="4" w:space="0" w:color="000000" w:themeColor="text1"/>
@@ -117,7 +117,7 @@
         </w:tc>
         <w:tc>
           <w:tcPr>
-            <w:tcW w:w="2135" w:type="dxa"/>
+            <w:tcW w:w="2107" w:type="dxa"/>
             <w:gridSpan w:val="3"/>
             <w:tcBorders>
               <w:top w:val="none" w:sz="4" w:space="0" w:color="000000" w:themeColor="text1"/>
@@ -140,11 +140,20 @@
                 <w:lang w:val="pl"/>
               </w:rPr>
             </w:pPr>
-          </w:p>
-        </w:tc>
-        <w:tc>
-          <w:tcPr>
-            <w:tcW w:w="698" w:type="dxa"/>
+            <w:r>
+              <w:rPr>
+                <w:rFonts w:ascii="Aptos" w:eastAsia="Aptos" w:hAnsi="Aptos" w:cs="Aptos"/>
+                <w:b/>
+                <w:bCs/>
+                <w:lang w:val="pl"/>
+              </w:rPr>
+              <w:t>Mecz #</w:t>
+            </w:r>
+          </w:p>
+        </w:tc>
+        <w:tc>
+          <w:tcPr>
+            <w:tcW w:w="685" w:type="dxa"/>
             <w:gridSpan w:val="2"/>
             <w:tcBorders>
               <w:top w:val="nil"/>
@@ -166,7 +175,7 @@
         </w:tc>
         <w:tc>
           <w:tcPr>
-            <w:tcW w:w="502" w:type="dxa"/>
+            <w:tcW w:w="498" w:type="dxa"/>
             <w:gridSpan w:val="2"/>
             <w:tcBorders>
               <w:top w:val="nil"/>
@@ -214,7 +223,7 @@
         </w:tc>
         <w:tc>
           <w:tcPr>
-            <w:tcW w:w="1064" w:type="dxa"/>
+            <w:tcW w:w="1050" w:type="dxa"/>
             <w:gridSpan w:val="2"/>
             <w:tcBorders>
               <w:top w:val="nil"/>
@@ -232,7 +241,7 @@
         </w:tc>
         <w:tc>
           <w:tcPr>
-            <w:tcW w:w="1604" w:type="dxa"/>
+            <w:tcW w:w="1526" w:type="dxa"/>
             <w:gridSpan w:val="2"/>
             <w:tcBorders>
               <w:top w:val="nil"/>
@@ -252,12 +261,12 @@
       <w:tr>
         <w:trPr>
           <w:gridAfter w:val="1"/>
-          <w:wAfter w:w="742" w:type="dxa"/>
+          <w:wAfter w:w="765" w:type="dxa"/>
           <w:trHeight w:val="570"/>
         </w:trPr>
         <w:tc>
           <w:tcPr>
-            <w:tcW w:w="2638" w:type="dxa"/>
+            <w:tcW w:w="2806" w:type="dxa"/>
             <w:gridSpan w:val="2"/>
             <w:tcBorders>
               <w:top w:val="none" w:sz="4" w:space="0" w:color="000000" w:themeColor="text1"/>
@@ -291,7 +300,7 @@
         </w:tc>
         <w:tc>
           <w:tcPr>
-            <w:tcW w:w="872" w:type="dxa"/>
+            <w:tcW w:w="865" w:type="dxa"/>
             <w:gridSpan w:val="2"/>
             <w:tcBorders>
               <w:top w:val="single" w:sz="4" w:space="0" w:color="000000" w:themeColor="text1"/>
@@ -319,22 +328,31 @@
               <w:t>Pkt</w:t>
             </w:r>
             <w:r>
-              <w:br/>
-            </w:r>
-            <w:r>
               <w:rPr>
                 <w:rFonts w:ascii="Aptos" w:eastAsia="Aptos" w:hAnsi="Aptos" w:cs="Aptos"/>
                 <w:b/>
                 <w:bCs/>
                 <w:lang w:val="pl"/>
               </w:rPr>
+              <w:t>.</w:t>
+            </w:r>
+            <w:r>
+              <w:br/>
+            </w:r>
+            <w:r>
+              <w:rPr>
+                <w:rFonts w:ascii="Aptos" w:eastAsia="Aptos" w:hAnsi="Aptos" w:cs="Aptos"/>
+                <w:b/>
+                <w:bCs/>
+                <w:lang w:val="pl"/>
+              </w:rPr>
               <w:t>SET 1</w:t>
             </w:r>
           </w:p>
         </w:tc>
         <w:tc>
           <w:tcPr>
-            <w:tcW w:w="810" w:type="dxa"/>
+            <w:tcW w:w="798" w:type="dxa"/>
             <w:tcBorders>
               <w:top w:val="single" w:sz="4" w:space="0" w:color="000000" w:themeColor="text1"/>
               <w:left w:val="single" w:sz="4" w:space="0" w:color="000000" w:themeColor="text1"/>
@@ -361,38 +379,17 @@
               <w:t>Pkt</w:t>
             </w:r>
             <w:r>
-              <w:br/>
-            </w:r>
-            <w:r>
               <w:rPr>
                 <w:rFonts w:ascii="Aptos" w:eastAsia="Aptos" w:hAnsi="Aptos" w:cs="Aptos"/>
                 <w:b/>
                 <w:bCs/>
                 <w:lang w:val="pl"/>
               </w:rPr>
-              <w:t>SET 2</w:t>
-            </w:r>
-          </w:p>
-        </w:tc>
-        <w:tc>
-          <w:tcPr>
-            <w:tcW w:w="810" w:type="dxa"/>
-            <w:tcBorders>
-              <w:top w:val="single" w:sz="4" w:space="0" w:color="000000" w:themeColor="text1"/>
-              <w:left w:val="single" w:sz="4" w:space="0" w:color="000000" w:themeColor="text1"/>
-              <w:bottom w:val="single" w:sz="4" w:space="0" w:color="auto"/>
-              <w:right w:val="single" w:sz="4" w:space="0" w:color="auto"/>
-            </w:tcBorders>
-            <w:tcMar>
-              <w:left w:w="108" w:type="dxa"/>
-              <w:right w:w="108" w:type="dxa"/>
-            </w:tcMar>
-            <w:vAlign w:val="center"/>
-          </w:tcPr>
-          <w:p>
-            <w:pPr>
-              <w:jc w:val="center"/>
-            </w:pPr>
+              <w:t>.</w:t>
+            </w:r>
+            <w:r>
+              <w:br/>
+            </w:r>
             <w:r>
               <w:rPr>
                 <w:rFonts w:ascii="Aptos" w:eastAsia="Aptos" w:hAnsi="Aptos" w:cs="Aptos"/>
@@ -400,11 +397,29 @@
                 <w:bCs/>
                 <w:lang w:val="pl"/>
               </w:rPr>
-              <w:t>Pkt</w:t>
-            </w:r>
-            <w:r>
-              <w:br/>
-            </w:r>
+              <w:t>SET 2</w:t>
+            </w:r>
+          </w:p>
+        </w:tc>
+        <w:tc>
+          <w:tcPr>
+            <w:tcW w:w="798" w:type="dxa"/>
+            <w:tcBorders>
+              <w:top w:val="single" w:sz="4" w:space="0" w:color="000000" w:themeColor="text1"/>
+              <w:left w:val="single" w:sz="4" w:space="0" w:color="000000" w:themeColor="text1"/>
+              <w:bottom w:val="single" w:sz="4" w:space="0" w:color="auto"/>
+              <w:right w:val="single" w:sz="4" w:space="0" w:color="auto"/>
+            </w:tcBorders>
+            <w:tcMar>
+              <w:left w:w="108" w:type="dxa"/>
+              <w:right w:w="108" w:type="dxa"/>
+            </w:tcMar>
+            <w:vAlign w:val="center"/>
+          </w:tcPr>
+          <w:p>
+            <w:pPr>
+              <w:jc w:val="center"/>
+            </w:pPr>
             <w:r>
               <w:rPr>
                 <w:rFonts w:ascii="Aptos" w:eastAsia="Aptos" w:hAnsi="Aptos" w:cs="Aptos"/>
@@ -412,30 +427,8 @@
                 <w:bCs/>
                 <w:lang w:val="pl"/>
               </w:rPr>
-              <w:t>SET 3</w:t>
-            </w:r>
-          </w:p>
-        </w:tc>
-        <w:tc>
-          <w:tcPr>
-            <w:tcW w:w="810" w:type="dxa"/>
-            <w:gridSpan w:val="2"/>
-            <w:tcBorders>
-              <w:top w:val="single" w:sz="4" w:space="0" w:color="000000" w:themeColor="text1"/>
-              <w:left w:val="single" w:sz="4" w:space="0" w:color="auto"/>
-              <w:bottom w:val="single" w:sz="4" w:space="0" w:color="auto"/>
-              <w:right w:val="single" w:sz="4" w:space="0" w:color="auto"/>
-            </w:tcBorders>
-            <w:tcMar>
-              <w:left w:w="108" w:type="dxa"/>
-              <w:right w:w="108" w:type="dxa"/>
-            </w:tcMar>
-            <w:vAlign w:val="center"/>
-          </w:tcPr>
-          <w:p>
-            <w:pPr>
-              <w:jc w:val="center"/>
-            </w:pPr>
+              <w:t>Pkt</w:t>
+            </w:r>
             <w:r>
               <w:rPr>
                 <w:rFonts w:ascii="Aptos" w:eastAsia="Aptos" w:hAnsi="Aptos" w:cs="Aptos"/>
@@ -443,7 +436,7 @@
                 <w:bCs/>
                 <w:lang w:val="pl"/>
               </w:rPr>
-              <w:t>Pkt</w:t>
+              <w:t>.</w:t>
             </w:r>
             <w:r>
               <w:br/>
@@ -455,31 +448,39 @@
                 <w:bCs/>
                 <w:lang w:val="pl"/>
               </w:rPr>
-              <w:t>SET 4</w:t>
-            </w:r>
-          </w:p>
-        </w:tc>
-        <w:tc>
-          <w:tcPr>
-            <w:tcW w:w="810" w:type="dxa"/>
-            <w:tcBorders>
-              <w:top w:val="single" w:sz="4" w:space="0" w:color="auto"/>
-              <w:left w:val="single" w:sz="4" w:space="0" w:color="auto"/>
-              <w:bottom w:val="single" w:sz="4" w:space="0" w:color="auto"/>
-              <w:right w:val="single" w:sz="4" w:space="0" w:color="auto"/>
-            </w:tcBorders>
+              <w:t>SET 3</w:t>
+            </w:r>
+          </w:p>
+        </w:tc>
+        <w:tc>
+          <w:tcPr>
+            <w:tcW w:w="798" w:type="dxa"/>
+            <w:gridSpan w:val="2"/>
+            <w:tcBorders>
+              <w:top w:val="single" w:sz="4" w:space="0" w:color="000000" w:themeColor="text1"/>
+              <w:left w:val="single" w:sz="4" w:space="0" w:color="auto"/>
+              <w:bottom w:val="single" w:sz="4" w:space="0" w:color="auto"/>
+              <w:right w:val="single" w:sz="4" w:space="0" w:color="auto"/>
+            </w:tcBorders>
+            <w:tcMar>
+              <w:left w:w="108" w:type="dxa"/>
+              <w:right w:w="108" w:type="dxa"/>
+            </w:tcMar>
             <w:vAlign w:val="center"/>
           </w:tcPr>
           <w:p>
             <w:pPr>
               <w:jc w:val="center"/>
+            </w:pPr>
+            <w:r>
               <w:rPr>
                 <w:rFonts w:ascii="Aptos" w:eastAsia="Aptos" w:hAnsi="Aptos" w:cs="Aptos"/>
                 <w:b/>
                 <w:bCs/>
                 <w:lang w:val="pl"/>
               </w:rPr>
-            </w:pPr>
+              <w:t>Pkt</w:t>
+            </w:r>
             <w:r>
               <w:rPr>
                 <w:rFonts w:ascii="Aptos" w:eastAsia="Aptos" w:hAnsi="Aptos" w:cs="Aptos"/>
@@ -487,7 +488,7 @@
                 <w:bCs/>
                 <w:lang w:val="pl"/>
               </w:rPr>
-              <w:t>Pkt</w:t>
+              <w:t>.</w:t>
             </w:r>
             <w:r>
               <w:br/>
@@ -499,41 +500,40 @@
                 <w:bCs/>
                 <w:lang w:val="pl"/>
               </w:rPr>
-              <w:t xml:space="preserve">SET </w:t>
-            </w:r>
-            <w:r>
+              <w:t>SET 4</w:t>
+            </w:r>
+          </w:p>
+        </w:tc>
+        <w:tc>
+          <w:tcPr>
+            <w:tcW w:w="803" w:type="dxa"/>
+            <w:tcBorders>
+              <w:top w:val="single" w:sz="4" w:space="0" w:color="auto"/>
+              <w:left w:val="single" w:sz="4" w:space="0" w:color="auto"/>
+              <w:bottom w:val="single" w:sz="4" w:space="0" w:color="auto"/>
+              <w:right w:val="single" w:sz="4" w:space="0" w:color="auto"/>
+            </w:tcBorders>
+            <w:vAlign w:val="center"/>
+          </w:tcPr>
+          <w:p>
+            <w:pPr>
+              <w:jc w:val="center"/>
               <w:rPr>
                 <w:rFonts w:ascii="Aptos" w:eastAsia="Aptos" w:hAnsi="Aptos" w:cs="Aptos"/>
                 <w:b/>
                 <w:bCs/>
                 <w:lang w:val="pl"/>
               </w:rPr>
-              <w:t>5</w:t>
-            </w:r>
-          </w:p>
-        </w:tc>
-        <w:tc>
-          <w:tcPr>
-            <w:tcW w:w="810" w:type="dxa"/>
-            <w:gridSpan w:val="2"/>
-            <w:tcBorders>
-              <w:top w:val="single" w:sz="4" w:space="0" w:color="auto"/>
-              <w:left w:val="single" w:sz="4" w:space="0" w:color="auto"/>
-              <w:bottom w:val="single" w:sz="4" w:space="0" w:color="auto"/>
-              <w:right w:val="single" w:sz="4" w:space="0" w:color="auto"/>
-            </w:tcBorders>
-            <w:vAlign w:val="center"/>
-          </w:tcPr>
-          <w:p>
-            <w:pPr>
-              <w:jc w:val="center"/>
+            </w:pPr>
+            <w:r>
               <w:rPr>
                 <w:rFonts w:ascii="Aptos" w:eastAsia="Aptos" w:hAnsi="Aptos" w:cs="Aptos"/>
                 <w:b/>
                 <w:bCs/>
                 <w:lang w:val="pl"/>
               </w:rPr>
-            </w:pPr>
+              <w:t>Pkt</w:t>
+            </w:r>
             <w:r>
               <w:rPr>
                 <w:rFonts w:ascii="Aptos" w:eastAsia="Aptos" w:hAnsi="Aptos" w:cs="Aptos"/>
@@ -541,7 +541,7 @@
                 <w:bCs/>
                 <w:lang w:val="pl"/>
               </w:rPr>
-              <w:t>Pkt</w:t>
+              <w:t>.</w:t>
             </w:r>
             <w:r>
               <w:br/>
@@ -562,13 +562,13 @@
                 <w:bCs/>
                 <w:lang w:val="pl"/>
               </w:rPr>
-              <w:t>6</w:t>
-            </w:r>
-          </w:p>
-        </w:tc>
-        <w:tc>
-          <w:tcPr>
-            <w:tcW w:w="810" w:type="dxa"/>
+              <w:t>5</w:t>
+            </w:r>
+          </w:p>
+        </w:tc>
+        <w:tc>
+          <w:tcPr>
+            <w:tcW w:w="797" w:type="dxa"/>
             <w:gridSpan w:val="2"/>
             <w:tcBorders>
               <w:top w:val="single" w:sz="4" w:space="0" w:color="auto"/>
@@ -576,28 +576,18 @@
               <w:bottom w:val="single" w:sz="4" w:space="0" w:color="auto"/>
               <w:right w:val="single" w:sz="4" w:space="0" w:color="auto"/>
             </w:tcBorders>
-            <w:tcMar>
-              <w:left w:w="108" w:type="dxa"/>
-              <w:right w:w="108" w:type="dxa"/>
-            </w:tcMar>
             <w:vAlign w:val="center"/>
           </w:tcPr>
           <w:p>
             <w:pPr>
               <w:jc w:val="center"/>
-            </w:pPr>
-            <w:r>
               <w:rPr>
                 <w:rFonts w:ascii="Aptos" w:eastAsia="Aptos" w:hAnsi="Aptos" w:cs="Aptos"/>
                 <w:b/>
                 <w:bCs/>
                 <w:lang w:val="pl"/>
               </w:rPr>
-              <w:t>Pkt</w:t>
-            </w:r>
-            <w:r>
-              <w:br/>
-            </w:r>
+            </w:pPr>
             <w:r>
               <w:rPr>
                 <w:rFonts w:ascii="Aptos" w:eastAsia="Aptos" w:hAnsi="Aptos" w:cs="Aptos"/>
@@ -605,7 +595,7 @@
                 <w:bCs/>
                 <w:lang w:val="pl"/>
               </w:rPr>
-              <w:t xml:space="preserve">SET </w:t>
+              <w:t>Pkt</w:t>
             </w:r>
             <w:r>
               <w:rPr>
@@ -614,30 +604,11 @@
                 <w:bCs/>
                 <w:lang w:val="pl"/>
               </w:rPr>
-              <w:t>7</w:t>
-            </w:r>
-          </w:p>
-        </w:tc>
-        <w:tc>
-          <w:tcPr>
-            <w:tcW w:w="900" w:type="dxa"/>
-            <w:gridSpan w:val="3"/>
-            <w:tcBorders>
-              <w:top w:val="single" w:sz="4" w:space="0" w:color="auto"/>
-              <w:left w:val="single" w:sz="4" w:space="0" w:color="auto"/>
-              <w:bottom w:val="single" w:sz="4" w:space="0" w:color="auto"/>
-              <w:right w:val="single" w:sz="4" w:space="0" w:color="auto"/>
-            </w:tcBorders>
-            <w:tcMar>
-              <w:left w:w="108" w:type="dxa"/>
-              <w:right w:w="108" w:type="dxa"/>
-            </w:tcMar>
-            <w:vAlign w:val="center"/>
-          </w:tcPr>
-          <w:p>
-            <w:pPr>
-              <w:jc w:val="center"/>
-            </w:pPr>
+              <w:t>.</w:t>
+            </w:r>
+            <w:r>
+              <w:br/>
+            </w:r>
             <w:r>
               <w:rPr>
                 <w:rFonts w:ascii="Aptos" w:eastAsia="Aptos" w:hAnsi="Aptos" w:cs="Aptos"/>
@@ -645,10 +616,7 @@
                 <w:bCs/>
                 <w:lang w:val="pl"/>
               </w:rPr>
-              <w:t>Wygr.</w:t>
-            </w:r>
-            <w:r>
-              <w:br/>
+              <w:t xml:space="preserve">SET </w:t>
             </w:r>
             <w:r>
               <w:rPr>
@@ -657,13 +625,117 @@
                 <w:bCs/>
                 <w:lang w:val="pl"/>
               </w:rPr>
+              <w:t>6</w:t>
+            </w:r>
+          </w:p>
+        </w:tc>
+        <w:tc>
+          <w:tcPr>
+            <w:tcW w:w="797" w:type="dxa"/>
+            <w:gridSpan w:val="2"/>
+            <w:tcBorders>
+              <w:top w:val="single" w:sz="4" w:space="0" w:color="auto"/>
+              <w:left w:val="single" w:sz="4" w:space="0" w:color="auto"/>
+              <w:bottom w:val="single" w:sz="4" w:space="0" w:color="auto"/>
+              <w:right w:val="single" w:sz="4" w:space="0" w:color="auto"/>
+            </w:tcBorders>
+            <w:tcMar>
+              <w:left w:w="108" w:type="dxa"/>
+              <w:right w:w="108" w:type="dxa"/>
+            </w:tcMar>
+            <w:vAlign w:val="center"/>
+          </w:tcPr>
+          <w:p>
+            <w:pPr>
+              <w:jc w:val="center"/>
+            </w:pPr>
+            <w:r>
+              <w:rPr>
+                <w:rFonts w:ascii="Aptos" w:eastAsia="Aptos" w:hAnsi="Aptos" w:cs="Aptos"/>
+                <w:b/>
+                <w:bCs/>
+                <w:lang w:val="pl"/>
+              </w:rPr>
+              <w:t>Pkt</w:t>
+            </w:r>
+            <w:r>
+              <w:rPr>
+                <w:rFonts w:ascii="Aptos" w:eastAsia="Aptos" w:hAnsi="Aptos" w:cs="Aptos"/>
+                <w:b/>
+                <w:bCs/>
+                <w:lang w:val="pl"/>
+              </w:rPr>
+              <w:t>.</w:t>
+            </w:r>
+            <w:r>
+              <w:br/>
+            </w:r>
+            <w:r>
+              <w:rPr>
+                <w:rFonts w:ascii="Aptos" w:eastAsia="Aptos" w:hAnsi="Aptos" w:cs="Aptos"/>
+                <w:b/>
+                <w:bCs/>
+                <w:lang w:val="pl"/>
+              </w:rPr>
+              <w:t xml:space="preserve">SET </w:t>
+            </w:r>
+            <w:r>
+              <w:rPr>
+                <w:rFonts w:ascii="Aptos" w:eastAsia="Aptos" w:hAnsi="Aptos" w:cs="Aptos"/>
+                <w:b/>
+                <w:bCs/>
+                <w:lang w:val="pl"/>
+              </w:rPr>
+              <w:t>7</w:t>
+            </w:r>
+          </w:p>
+        </w:tc>
+        <w:tc>
+          <w:tcPr>
+            <w:tcW w:w="896" w:type="dxa"/>
+            <w:gridSpan w:val="3"/>
+            <w:tcBorders>
+              <w:top w:val="single" w:sz="4" w:space="0" w:color="auto"/>
+              <w:left w:val="single" w:sz="4" w:space="0" w:color="auto"/>
+              <w:bottom w:val="single" w:sz="4" w:space="0" w:color="auto"/>
+              <w:right w:val="single" w:sz="4" w:space="0" w:color="auto"/>
+            </w:tcBorders>
+            <w:tcMar>
+              <w:left w:w="108" w:type="dxa"/>
+              <w:right w:w="108" w:type="dxa"/>
+            </w:tcMar>
+            <w:vAlign w:val="center"/>
+          </w:tcPr>
+          <w:p>
+            <w:pPr>
+              <w:jc w:val="center"/>
+            </w:pPr>
+            <w:r>
+              <w:rPr>
+                <w:rFonts w:ascii="Aptos" w:eastAsia="Aptos" w:hAnsi="Aptos" w:cs="Aptos"/>
+                <w:b/>
+                <w:bCs/>
+                <w:lang w:val="pl"/>
+              </w:rPr>
+              <w:t>Wygr.</w:t>
+            </w:r>
+            <w:r>
+              <w:br/>
+            </w:r>
+            <w:r>
+              <w:rPr>
+                <w:rFonts w:ascii="Aptos" w:eastAsia="Aptos" w:hAnsi="Aptos" w:cs="Aptos"/>
+                <w:b/>
+                <w:bCs/>
+                <w:lang w:val="pl"/>
+              </w:rPr>
               <w:t xml:space="preserve"> sety</w:t>
             </w:r>
           </w:p>
         </w:tc>
         <w:tc>
           <w:tcPr>
-            <w:tcW w:w="1463" w:type="dxa"/>
+            <w:tcW w:w="1352" w:type="dxa"/>
             <w:gridSpan w:val="2"/>
             <w:tcBorders>
               <w:top w:val="single" w:sz="4" w:space="0" w:color="auto"/>
@@ -696,12 +768,12 @@
       <w:tr>
         <w:trPr>
           <w:gridAfter w:val="1"/>
-          <w:wAfter w:w="742" w:type="dxa"/>
+          <w:wAfter w:w="765" w:type="dxa"/>
           <w:trHeight w:val="480"/>
         </w:trPr>
         <w:tc>
           <w:tcPr>
-            <w:tcW w:w="2638" w:type="dxa"/>
+            <w:tcW w:w="2806" w:type="dxa"/>
             <w:gridSpan w:val="2"/>
             <w:tcBorders>
               <w:top w:val="single" w:sz="4" w:space="0" w:color="000000" w:themeColor="text1"/>
@@ -734,7 +806,7 @@
         </w:tc>
         <w:tc>
           <w:tcPr>
-            <w:tcW w:w="872" w:type="dxa"/>
+            <w:tcW w:w="865" w:type="dxa"/>
             <w:gridSpan w:val="2"/>
             <w:tcBorders>
               <w:top w:val="single" w:sz="4" w:space="0" w:color="000000" w:themeColor="text1"/>
@@ -759,7 +831,7 @@
         </w:tc>
         <w:tc>
           <w:tcPr>
-            <w:tcW w:w="810" w:type="dxa"/>
+            <w:tcW w:w="798" w:type="dxa"/>
             <w:tcBorders>
               <w:top w:val="single" w:sz="4" w:space="0" w:color="000000" w:themeColor="text1"/>
               <w:left w:val="single" w:sz="4" w:space="0" w:color="auto"/>
@@ -783,7 +855,7 @@
         </w:tc>
         <w:tc>
           <w:tcPr>
-            <w:tcW w:w="810" w:type="dxa"/>
+            <w:tcW w:w="798" w:type="dxa"/>
             <w:tcBorders>
               <w:top w:val="single" w:sz="4" w:space="0" w:color="auto"/>
               <w:left w:val="single" w:sz="4" w:space="0" w:color="auto"/>
@@ -807,7 +879,7 @@
         </w:tc>
         <w:tc>
           <w:tcPr>
-            <w:tcW w:w="810" w:type="dxa"/>
+            <w:tcW w:w="798" w:type="dxa"/>
             <w:gridSpan w:val="2"/>
             <w:tcBorders>
               <w:top w:val="single" w:sz="4" w:space="0" w:color="auto"/>
@@ -831,7 +903,7 @@
         </w:tc>
         <w:tc>
           <w:tcPr>
-            <w:tcW w:w="810" w:type="dxa"/>
+            <w:tcW w:w="803" w:type="dxa"/>
             <w:tcBorders>
               <w:top w:val="single" w:sz="4" w:space="0" w:color="auto"/>
               <w:left w:val="single" w:sz="4" w:space="0" w:color="auto"/>
@@ -850,7 +922,7 @@
         </w:tc>
         <w:tc>
           <w:tcPr>
-            <w:tcW w:w="810" w:type="dxa"/>
+            <w:tcW w:w="797" w:type="dxa"/>
             <w:gridSpan w:val="2"/>
             <w:tcBorders>
               <w:top w:val="single" w:sz="4" w:space="0" w:color="auto"/>
@@ -870,7 +942,7 @@
         </w:tc>
         <w:tc>
           <w:tcPr>
-            <w:tcW w:w="810" w:type="dxa"/>
+            <w:tcW w:w="797" w:type="dxa"/>
             <w:gridSpan w:val="2"/>
             <w:tcBorders>
               <w:top w:val="single" w:sz="4" w:space="0" w:color="auto"/>
@@ -894,7 +966,7 @@
         </w:tc>
         <w:tc>
           <w:tcPr>
-            <w:tcW w:w="900" w:type="dxa"/>
+            <w:tcW w:w="896" w:type="dxa"/>
             <w:gridSpan w:val="3"/>
             <w:tcBorders>
               <w:top w:val="single" w:sz="4" w:space="0" w:color="auto"/>
@@ -919,7 +991,7 @@
         </w:tc>
         <w:tc>
           <w:tcPr>
-            <w:tcW w:w="1463" w:type="dxa"/>
+            <w:tcW w:w="1352" w:type="dxa"/>
             <w:gridSpan w:val="2"/>
             <w:tcBorders>
               <w:top w:val="single" w:sz="4" w:space="0" w:color="auto"/>
@@ -946,12 +1018,12 @@
       <w:tr>
         <w:trPr>
           <w:gridAfter w:val="1"/>
-          <w:wAfter w:w="742" w:type="dxa"/>
+          <w:wAfter w:w="765" w:type="dxa"/>
           <w:trHeight w:val="480"/>
         </w:trPr>
         <w:tc>
           <w:tcPr>
-            <w:tcW w:w="2638" w:type="dxa"/>
+            <w:tcW w:w="2806" w:type="dxa"/>
             <w:gridSpan w:val="2"/>
             <w:tcBorders>
               <w:top w:val="single" w:sz="4" w:space="0" w:color="auto"/>
@@ -984,7 +1056,7 @@
         </w:tc>
         <w:tc>
           <w:tcPr>
-            <w:tcW w:w="872" w:type="dxa"/>
+            <w:tcW w:w="865" w:type="dxa"/>
             <w:gridSpan w:val="2"/>
             <w:tcBorders>
               <w:top w:val="single" w:sz="4" w:space="0" w:color="auto"/>
@@ -1009,7 +1081,7 @@
         </w:tc>
         <w:tc>
           <w:tcPr>
-            <w:tcW w:w="810" w:type="dxa"/>
+            <w:tcW w:w="798" w:type="dxa"/>
             <w:tcBorders>
               <w:top w:val="single" w:sz="4" w:space="0" w:color="auto"/>
               <w:left w:val="single" w:sz="4" w:space="0" w:color="auto"/>
@@ -1033,7 +1105,7 @@
         </w:tc>
         <w:tc>
           <w:tcPr>
-            <w:tcW w:w="810" w:type="dxa"/>
+            <w:tcW w:w="798" w:type="dxa"/>
             <w:tcBorders>
               <w:top w:val="single" w:sz="4" w:space="0" w:color="auto"/>
               <w:left w:val="single" w:sz="4" w:space="0" w:color="auto"/>
@@ -1057,7 +1129,7 @@
         </w:tc>
         <w:tc>
           <w:tcPr>
-            <w:tcW w:w="810" w:type="dxa"/>
+            <w:tcW w:w="798" w:type="dxa"/>
             <w:gridSpan w:val="2"/>
             <w:tcBorders>
               <w:top w:val="single" w:sz="4" w:space="0" w:color="auto"/>
@@ -1081,7 +1153,7 @@
         </w:tc>
         <w:tc>
           <w:tcPr>
-            <w:tcW w:w="810" w:type="dxa"/>
+            <w:tcW w:w="803" w:type="dxa"/>
             <w:tcBorders>
               <w:top w:val="single" w:sz="4" w:space="0" w:color="auto"/>
               <w:left w:val="single" w:sz="4" w:space="0" w:color="auto"/>
@@ -1100,7 +1172,7 @@
         </w:tc>
         <w:tc>
           <w:tcPr>
-            <w:tcW w:w="810" w:type="dxa"/>
+            <w:tcW w:w="797" w:type="dxa"/>
             <w:gridSpan w:val="2"/>
             <w:tcBorders>
               <w:top w:val="single" w:sz="4" w:space="0" w:color="auto"/>
@@ -1120,7 +1192,7 @@
         </w:tc>
         <w:tc>
           <w:tcPr>
-            <w:tcW w:w="810" w:type="dxa"/>
+            <w:tcW w:w="797" w:type="dxa"/>
             <w:gridSpan w:val="2"/>
             <w:tcBorders>
               <w:top w:val="single" w:sz="4" w:space="0" w:color="auto"/>
@@ -1144,7 +1216,7 @@
         </w:tc>
         <w:tc>
           <w:tcPr>
-            <w:tcW w:w="900" w:type="dxa"/>
+            <w:tcW w:w="896" w:type="dxa"/>
             <w:gridSpan w:val="3"/>
             <w:tcBorders>
               <w:top w:val="single" w:sz="4" w:space="0" w:color="auto"/>
@@ -1169,7 +1241,7 @@
         </w:tc>
         <w:tc>
           <w:tcPr>
-            <w:tcW w:w="1463" w:type="dxa"/>
+            <w:tcW w:w="1352" w:type="dxa"/>
             <w:gridSpan w:val="2"/>
             <w:tcBorders>
               <w:top w:val="single" w:sz="4" w:space="0" w:color="auto"/>
@@ -21608,6 +21680,26 @@
 </file>
 
 <file path=customXml/item1.xml><?xml version="1.0" encoding="utf-8"?>
+<p:properties xmlns:p="http://schemas.microsoft.com/office/2006/metadata/properties" xmlns:xsi="http://www.w3.org/2001/XMLSchema-instance" xmlns:pc="http://schemas.microsoft.com/office/infopath/2007/PartnerControls">
+  <documentManagement>
+    <TaxCatchAll xmlns="6e3c809f-d77f-4965-8c59-52bc5988e08d" xsi:nil="true"/>
+    <lcf76f155ced4ddcb4097134ff3c332f xmlns="6011e175-94d7-470b-a25b-96e606435ba7">
+      <Terms xmlns="http://schemas.microsoft.com/office/infopath/2007/PartnerControls"/>
+    </lcf76f155ced4ddcb4097134ff3c332f>
+  </documentManagement>
+</p:properties>
+</file>
+
+<file path=customXml/item2.xml><?xml version="1.0" encoding="utf-8"?>
+<?mso-contentType ?>
+<FormTemplates xmlns="http://schemas.microsoft.com/sharepoint/v3/contenttype/forms">
+  <Display>DocumentLibraryForm</Display>
+  <Edit>DocumentLibraryForm</Edit>
+  <New>DocumentLibraryForm</New>
+</FormTemplates>
+</file>
+
+<file path=customXml/item3.xml><?xml version="1.0" encoding="utf-8"?>
 <ct:contentTypeSchema xmlns:ct="http://schemas.microsoft.com/office/2006/metadata/contentType" xmlns:ma="http://schemas.microsoft.com/office/2006/metadata/properties/metaAttributes" ct:_="" ma:_="" ma:contentTypeName="Dokument" ma:contentTypeID="0x010100E02B0782D6F96B44A7C1A6483B3F88A5" ma:contentTypeVersion="10" ma:contentTypeDescription="Utwórz nowy dokument." ma:contentTypeScope="" ma:versionID="dafbd3aba1efe586ac978fd8b8b0afe5">
   <xsd:schema xmlns:xsd="http://www.w3.org/2001/XMLSchema" xmlns:xs="http://www.w3.org/2001/XMLSchema" xmlns:p="http://schemas.microsoft.com/office/2006/metadata/properties" xmlns:ns2="6011e175-94d7-470b-a25b-96e606435ba7" xmlns:ns3="6e3c809f-d77f-4965-8c59-52bc5988e08d" targetNamespace="http://schemas.microsoft.com/office/2006/metadata/properties" ma:root="true" ma:fieldsID="632b28c003267633fc74dc71523c1969" ns2:_="" ns3:_="">
     <xsd:import namespace="6011e175-94d7-470b-a25b-96e606435ba7"/>
@@ -21796,27 +21888,26 @@
 </ct:contentTypeSchema>
 </file>
 
-<file path=customXml/item2.xml><?xml version="1.0" encoding="utf-8"?>
-<?mso-contentType ?>
-<FormTemplates xmlns="http://schemas.microsoft.com/sharepoint/v3/contenttype/forms">
-  <Display>DocumentLibraryForm</Display>
-  <Edit>DocumentLibraryForm</Edit>
-  <New>DocumentLibraryForm</New>
-</FormTemplates>
+<file path=customXml/itemProps1.xml><?xml version="1.0" encoding="utf-8"?>
+<ds:datastoreItem xmlns:ds="http://schemas.openxmlformats.org/officeDocument/2006/customXml" ds:itemID="{F05BD065-0207-4F18-A561-8170BF1FF0CA}">
+  <ds:schemaRefs>
+    <ds:schemaRef ds:uri="http://schemas.microsoft.com/office/2006/metadata/properties"/>
+    <ds:schemaRef ds:uri="http://schemas.microsoft.com/office/infopath/2007/PartnerControls"/>
+    <ds:schemaRef ds:uri="6e3c809f-d77f-4965-8c59-52bc5988e08d"/>
+    <ds:schemaRef ds:uri="6011e175-94d7-470b-a25b-96e606435ba7"/>
+  </ds:schemaRefs>
+</ds:datastoreItem>
 </file>
 
-<file path=customXml/item3.xml><?xml version="1.0" encoding="utf-8"?>
-<p:properties xmlns:p="http://schemas.microsoft.com/office/2006/metadata/properties" xmlns:xsi="http://www.w3.org/2001/XMLSchema-instance" xmlns:pc="http://schemas.microsoft.com/office/infopath/2007/PartnerControls">
-  <documentManagement>
-    <TaxCatchAll xmlns="6e3c809f-d77f-4965-8c59-52bc5988e08d" xsi:nil="true"/>
-    <lcf76f155ced4ddcb4097134ff3c332f xmlns="6011e175-94d7-470b-a25b-96e606435ba7">
-      <Terms xmlns="http://schemas.microsoft.com/office/infopath/2007/PartnerControls"/>
-    </lcf76f155ced4ddcb4097134ff3c332f>
-  </documentManagement>
-</p:properties>
+<file path=customXml/itemProps2.xml><?xml version="1.0" encoding="utf-8"?>
+<ds:datastoreItem xmlns:ds="http://schemas.openxmlformats.org/officeDocument/2006/customXml" ds:itemID="{6A802E19-EF36-445D-9103-1CF66682A738}">
+  <ds:schemaRefs>
+    <ds:schemaRef ds:uri="http://schemas.microsoft.com/sharepoint/v3/contenttype/forms"/>
+  </ds:schemaRefs>
+</ds:datastoreItem>
 </file>
 
-<file path=customXml/itemProps1.xml><?xml version="1.0" encoding="utf-8"?>
+<file path=customXml/itemProps3.xml><?xml version="1.0" encoding="utf-8"?>
 <ds:datastoreItem xmlns:ds="http://schemas.openxmlformats.org/officeDocument/2006/customXml" ds:itemID="{74ACB354-4589-4E2C-8EB9-D1A3D326D444}">
   <ds:schemaRefs>
     <ds:schemaRef ds:uri="http://schemas.microsoft.com/office/2006/metadata/contentType"/>
@@ -21833,23 +21924,4 @@
     <ds:schemaRef ds:uri="http://schemas.microsoft.com/internal/obd"/>
   </ds:schemaRefs>
 </ds:datastoreItem>
-</file>
-
-<file path=customXml/itemProps2.xml><?xml version="1.0" encoding="utf-8"?>
-<ds:datastoreItem xmlns:ds="http://schemas.openxmlformats.org/officeDocument/2006/customXml" ds:itemID="{6A802E19-EF36-445D-9103-1CF66682A738}">
-  <ds:schemaRefs>
-    <ds:schemaRef ds:uri="http://schemas.microsoft.com/sharepoint/v3/contenttype/forms"/>
-  </ds:schemaRefs>
-</ds:datastoreItem>
-</file>
-
-<file path=customXml/itemProps3.xml><?xml version="1.0" encoding="utf-8"?>
-<ds:datastoreItem xmlns:ds="http://schemas.openxmlformats.org/officeDocument/2006/customXml" ds:itemID="{F05BD065-0207-4F18-A561-8170BF1FF0CA}">
-  <ds:schemaRefs>
-    <ds:schemaRef ds:uri="http://schemas.microsoft.com/office/2006/metadata/properties"/>
-    <ds:schemaRef ds:uri="http://schemas.microsoft.com/office/infopath/2007/PartnerControls"/>
-    <ds:schemaRef ds:uri="6e3c809f-d77f-4965-8c59-52bc5988e08d"/>
-    <ds:schemaRef ds:uri="6011e175-94d7-470b-a25b-96e606435ba7"/>
-  </ds:schemaRefs>
-</ds:datastoreItem>
 </file>
</xml_diff>